<commit_message>
Final polish on the WoWaP
</commit_message>
<xml_diff>
--- a/lovecraft/Beardsley - Podsothoth - 2026-08-29 - The Weirdness of War and Pestilence.docx
+++ b/lovecraft/Beardsley - Podsothoth - 2026-08-29 - The Weirdness of War and Pestilence.docx
@@ -188,7 +188,7 @@
         <w:pStyle w:val="FirstParagraph"/>
       </w:pPr>
       <w:r>
-        <w:t xml:space="preserve">World War I, practically by definition, was the first modern war the world had experienced and set the cadence for all major conflicts that would follow. The scale of death and destruction had never been seen before, with battlefields stretching hundreds of miles and advances measured in inches under constant barrage of long-distance artillery and horrifically innovative gas attacks. The pace of military technological advancement between 1910 and 1920 was unprecedented (Carlin 2013). Two major technologies defined the war:</w:t>
+        <w:t xml:space="preserve">World War I, practically by definition, was the first modern war the world had experienced and set the cadence for all major conflicts that would follow. The scale of death and destruction had never been seen before, with battlefields stretching hundreds of miles and advances measured in inches under constant barrage of long-distance artillery and horrifically innovative gas attacks. The pace of military technological advancement between 1910 and 1920 was unprecedented (Carlin 2013). Two major technologies defined the war.</w:t>
       </w:r>
     </w:p>
     <w:p>
@@ -200,7 +200,7 @@
         </w:numPr>
       </w:pPr>
       <w:r>
-        <w:t xml:space="preserve">Gas warfare: chlorine gas, followed by other chemical weapons, culminated in mustard gas which was terrifying for soldiers. Gas masks themselves transformed the physical countenance of the modern soldier from a dashingly handsome cavalryman into a technological monster, appearing both science-fiction and utterly alien.</w:t>
+        <w:t xml:space="preserve">Gas warfare: Chlorine gas, followed by other chemical weapons, culminated in mustard gas which was terrifying for soldiers. Gas masks themselves transformed the physical countenance of the modern soldier from a dashingly handsome cavalryman into a technological monster, appearing both science-fiction and utterly alien.</w:t>
       </w:r>
       <w:r>
         <w:br/>
@@ -215,7 +215,7 @@
         </w:numPr>
       </w:pPr>
       <w:r>
-        <w:t xml:space="preserve">Artillery: constant shelling defined the experience of the war. Shelling accounted for millions of deaths and completely changed the landscape of Belgium and Northern France both physically and psychologically. Shelling became the primary method for delivering gas attacks, and soldiers could not predict mere explosive ordnance or the more sinister payloads of chlorine and mustard gas.</w:t>
+        <w:t xml:space="preserve">Artillery: Constant shelling defined the experience of the war. Shelling accounted for millions of deaths and completely changed the landscape of Belgium and Northern France both physically and psychologically. Shelling became the primary method for delivering gas attacks, and soldiers could not predict mere explosive ordnance or the more sinister payloads of chlorine and mustard gas.</w:t>
       </w:r>
     </w:p>
     <w:p>
@@ -532,7 +532,7 @@
         <w:t xml:space="preserve"> </w:t>
       </w:r>
       <w:r>
-        <w:t xml:space="preserve">ones he despises, had the more accurate read on their situation all along. Lovecraft uses Heinrich’s chauvinism against him: the Kommandant’s certainty of his own superiority becomes the mechanism of his destruction.</w:t>
+        <w:t xml:space="preserve">ones he despises, had the more accurate read on their situation all along. Lovecraft uses Heinrich’s chauvinism against him. The Kommandant’s certainty of his own superiority becomes the mechanism of his destruction.</w:t>
       </w:r>
     </w:p>
     <w:bookmarkEnd w:id="15"/>
@@ -562,7 +562,7 @@
         <w:t xml:space="preserve"> </w:t>
       </w:r>
       <w:r>
-        <w:t xml:space="preserve">is discussed later in this paper in terms of Lovecraft’s response to the 1918 flu, one installment of his 1921-1922 serial takes place entirely on the battlefield Flanders. West and his aide (and the story’s narrator) enlist in a Canadian regiment in 1915, apparently with the specific goal of running around the blood-and-mud muck of the European theater to continue experimenting with reanimating corpse-parts. Of course, there’s plenty of material to work with, given the nature of World War I combat: there was an</w:t>
+        <w:t xml:space="preserve">is discussed later in this paper in terms of Lovecraft’s response to the 1918 flu, one installment of his 1921-1922 serial takes place entirely on the battlefield Flanders. West and his aide (and the story’s narrator) enlist in a Canadian regiment in 1915, apparently with the specific goal of running around the blood-and-mud muck of the European theater to continue experimenting with reanimating corpse-parts. Of course, there’s plenty of material to work with, given the nature of World War I combat; there was an</w:t>
       </w:r>
       <w:r>
         <w:t xml:space="preserve"> </w:t>
@@ -744,7 +744,7 @@
         <w:t xml:space="preserve"> </w:t>
       </w:r>
       <w:r>
-        <w:t xml:space="preserve">culminating in Delapore’s ravings:</w:t>
+        <w:t xml:space="preserve">culminating in Delapore’s ravings,</w:t>
       </w:r>
       <w:r>
         <w:t xml:space="preserve"> </w:t>
@@ -814,15 +814,15 @@
         <w:t xml:space="preserve"> </w:t>
       </w:r>
       <w:r>
-        <w:t xml:space="preserve">(Joshi 2020), despite the flu killing dozens of his Providence neighbors at its peak in October of 1918. This near-silence is not incidental. Rather, it reflects a broader cultural suppression that swept the pandemic almost entirely from public memory, even as it claimed American lives at ten times the rate of the war (CDC 2018; VA 2026). The flu infected Lovecraft with an emotional residue he could neither name nor escape: a generalized, creeping dread of invisible forces, institutional failure, and the irony of a healthful constitution offering no protection.</w:t>
-      </w:r>
-    </w:p>
-    <w:p>
-      <w:pPr>
-        <w:pStyle w:val="BodyText"/>
-      </w:pPr>
-      <w:r>
-        <w:t xml:space="preserve">The evidence examined here falls into three categories: Lovecraft’s deep and personal distrust of medicine as an institution, reflected most directly in the serial</w:t>
+        <w:t xml:space="preserve">(Joshi 2020), despite the flu killing dozens of his Providence neighbors at its peak in October of 1918. This near-silence is not incidental. Rather, it reflects a broader cultural suppression that swept the pandemic almost entirely from public memory, even as it claimed American lives at ten times the rate of the war (CDC 2018; VA 2026). The flu infected Lovecraft with an emotional residue he could neither name nor escape, a generalized, creeping dread of invisible forces, institutional failure, and the irony of a healthful constitution offering no protection.</w:t>
+      </w:r>
+    </w:p>
+    <w:p>
+      <w:pPr>
+        <w:pStyle w:val="BodyText"/>
+      </w:pPr>
+      <w:r>
+        <w:t xml:space="preserve">The evidence examined here falls into three categories. First, Lovecraft’s deep and personal distrust of medicine as an institution, reflected most directly in the serial</w:t>
       </w:r>
       <w:r>
         <w:t xml:space="preserve"> </w:t>
@@ -843,7 +843,7 @@
         <w:t xml:space="preserve">“The Last Test”</w:t>
       </w:r>
       <w:r>
-        <w:t xml:space="preserve">; a recurring theme of invisible, indescribable, or otherwise ineffable threats which map onto the pandemic’s cultural footprint; and the biographical context that made Lovecraft uniquely primed to process medical horror unconsciously as a man blocked from military service by his own physician, who watched both parents deteriorate and die in institutional care, and who ultimately succumbed to a cancer that medicine of his era could not have possibly treated. For Lovecraft, the failure of medicine, as an institution, was more than a regrettable social shortcoming – it’s the family curse.</w:t>
+        <w:t xml:space="preserve">. Second, a recurring theme of invisible, indescribable, or otherwise ineffable threats which map onto the pandemic’s cultural footprint. Third, the biographical context that made Lovecraft uniquely primed to process medical horror unconsciously. He was a man blocked from military service by his own physician, who watched both parents deteriorate and die in institutional care, and who ultimately succumbed to a cancer that medicine of his era could not have possibly treated. For Lovecraft, the failure of medicine, as an institution, was more than a regrettable social shortcoming. It’s the family curse.</w:t>
       </w:r>
     </w:p>
     <w:bookmarkStart w:id="20" w:name="end-of-the-war-and-a-new-horror-at-home"/>
@@ -878,7 +878,7 @@
         <w:pStyle w:val="FirstParagraph"/>
       </w:pPr>
       <w:r>
-        <w:t xml:space="preserve">Lovecraft was a prolific correspondent, yet his surviving letters say remarkably little about the pandemic itself. Almost weirdly so, given that he reports so much about his day-to-day life and about cultural observations, from his thoughts on the German belligerence to his youthful distaste for cigarettes (SL I). What few mentions survive are almost always incidental rather than reflective: his collaborator Winifred Virginia Jackson, for instance, appears in his correspondence as ill with the flu and dictating letters through a nurse, a detail that would later seed their joint story</w:t>
+        <w:t xml:space="preserve">Lovecraft was a prolific correspondent, yet his surviving letters say remarkably little about the pandemic itself. Almost weirdly so, given that he reports so much about his day-to-day life and about cultural observations, from his thoughts on the German belligerence to his youthful distaste for cigarettes (SL I). What few mentions survive are almost always incidental rather than reflective. His collaborator Winifred Virginia Jackson, for instance, appears in his correspondence as ill with the flu and dictating letters through a nurse, a detail that would later seed their joint story</w:t>
       </w:r>
       <w:r>
         <w:t xml:space="preserve"> </w:t>
@@ -964,7 +964,7 @@
         <w:pStyle w:val="FirstParagraph"/>
       </w:pPr>
       <w:r>
-        <w:t xml:space="preserve">Lovecraft himself didn’t put much stock in medical science, and it failed him again and again. Both of his parents died while institutionalized, and the medical community was largely powerless in the face of the pandemic: the medical establishment disagreed on virtually every salient aspect of the flu, from its cause (microbial or viral?) to the effectiveness of vaccination (which was itself of dubious value without an understanding of the viral nature of the flu), to the efficacy of quarantine and public closures. As mentioned before, Lovecraft himself was blocked from enlisting in Rhode Island National Guard by his family physician, citing Lovecraft’s inherent frailty and weak constitution, rather than any specific ailment.</w:t>
+        <w:t xml:space="preserve">Lovecraft himself didn’t put much stock in medical science, and it failed him again and again. Both of his parents died while institutionalized, and the medical community was largely powerless in the face of the pandemic. The medical establishment disagreed on virtually every salient aspect of the flu, from its cause (microbial or viral?) to the effectiveness of vaccination (which was itself of dubious value without an understanding of the viral nature of the flu), to the efficacy of quarantine and public closures. As mentioned before, Lovecraft himself was blocked from enlisting in Rhode Island National Guard by his family physician, citing Lovecraft’s inherent frailty and weak constitution, rather than any specific ailment.</w:t>
       </w:r>
     </w:p>
     <w:p>
@@ -1142,7 +1142,7 @@
         <w:t xml:space="preserve"> </w:t>
       </w:r>
       <w:r>
-        <w:t xml:space="preserve">is centered on a typhoid outbreak, which is a clear stand-in for the real world 1918 flu pandemic: the school is closed, people are dying from the disease at alarming rates, and the community’s medical infrastructure is stretched thin. We also delve deeper into the character of West: again, he’s arrogant and petty, and the greater medical establishment is cast as</w:t>
+        <w:t xml:space="preserve">is centered on a typhoid outbreak, which is a clear stand-in for the real world 1918 flu pandemic. The school is closed, people are dying from the disease at alarming rates, and the community’s medical infrastructure is stretched thin. We also delve deeper into the character of West. He’s arrogant and petty, and the greater medical establishment is cast as</w:t>
       </w:r>
       <w:r>
         <w:t xml:space="preserve"> </w:t>
@@ -1174,15 +1174,15 @@
         <w:pStyle w:val="BodyText"/>
       </w:pPr>
       <w:r>
-        <w:t xml:space="preserve">The story culminates in the reanimation of Dr. Halsey himself, who died a hero through his selfless work combatting the typhoid outbreak. West attends the funeral with the other students, but is suspiciously out late with the narrator, returning home with a mysterious third, and after a scuffle, this mystery man escapes into the night. The sequence is unambiguous: West went from the graveside to the grave, with one purpose in mind.</w:t>
-      </w:r>
-    </w:p>
-    <w:p>
-      <w:pPr>
-        <w:pStyle w:val="BodyText"/>
-      </w:pPr>
-      <w:r>
-        <w:t xml:space="preserve">Lovecraft engineers this outcome with precision: the establishment figure who called West’s theories</w:t>
+        <w:t xml:space="preserve">The story culminates in the reanimation of Dr. Halsey himself, who died a hero through his selfless work combatting the typhoid outbreak. West attends the funeral with the other students, but is suspiciously out late with the narrator, returning home with a mysterious third, and after a scuffle, this mystery man escapes into the night. The sequence is unambiguous. West went from the graveside to the grave, with one purpose in mind.</w:t>
+      </w:r>
+    </w:p>
+    <w:p>
+      <w:pPr>
+        <w:pStyle w:val="BodyText"/>
+      </w:pPr>
+      <w:r>
+        <w:t xml:space="preserve">Lovecraft engineers this outcome with precision. The establishment figure who called West’s theories</w:t>
       </w:r>
       <w:r>
         <w:t xml:space="preserve"> </w:t>
@@ -1226,7 +1226,7 @@
         <w:pStyle w:val="BodyText"/>
       </w:pPr>
       <w:r>
-        <w:t xml:space="preserve">This conclusion also carries a more personal resonance. The image of a brilliant man reduced to an asylum cell is a dark reflection of Lovecraft’s own family history: his father was committed after a likely syphilis-induced breakdown, and his mother was institutionalized at the end of her life as well.</w:t>
+        <w:t xml:space="preserve">This conclusion also carries a more personal resonance. The image of a brilliant man reduced to an asylum cell is a dark reflection of Lovecraft’s own family history, since his father was committed after a likely syphilis-induced breakdown, and his mother was institutionalized at the end of her life as well.</w:t>
       </w:r>
     </w:p>
     <w:p>
@@ -1366,7 +1366,7 @@
         <w:pStyle w:val="BodyText"/>
       </w:pPr>
       <w:r>
-        <w:t xml:space="preserve">Dr. Clarendon shows a clear preference for baseline healthy subjects on which to test his engineered fever. This finds a striking parallel with the real 1918 flu, which produced one of its most baffling and devastating features: an anomalous mortality pattern in which young, healthy adults died at far higher rates than the elderly or frail. The mechanism was known as a</w:t>
+        <w:t xml:space="preserve">Dr. Clarendon shows a clear preference for baseline healthy subjects on which to test his engineered fever. This finds a striking parallel with the real 1918 flu, which produced one of its most baffling and devastating features; an anomalous mortality pattern in which young, healthy adults died at far higher rates than the elderly or frail. The mechanism is now widly believed to have been a</w:t>
       </w:r>
       <w:r>
         <w:t xml:space="preserve"> </w:t>
@@ -1399,7 +1399,7 @@
         <w:t xml:space="preserve"> </w:t>
       </w:r>
       <w:r>
-        <w:t xml:space="preserve">1918). That policy remained a live controversy years later: Lovecraft recalled in a 1925 letter to his aunt that Dr. Copeland of New York had</w:t>
+        <w:t xml:space="preserve">1918). That policy remained a live controversy years later. Lovecraft recalled in a 1925 letter to his aunt that Dr. Copeland of New York had</w:t>
       </w:r>
       <w:r>
         <w:t xml:space="preserve"> </w:t>
@@ -1523,7 +1523,7 @@
         <w:pStyle w:val="FirstParagraph"/>
       </w:pPr>
       <w:r>
-        <w:t xml:space="preserve">An unprecedented war, immediately followed by an unprecedented pandemic, taken together, are the cultural set pieces for Lovecraft’s particular brand of cosmic nihilism: The more we learn about the world, the more dangerous and uncaring it’s revealed to be. Artillery shells don’t discriminate between the valorous and the cowardly, and the artillery operators themselves were miles away, shelling with explosives and poisons indiscriminately. The flu, a mysterious, invisible force, claimed victims across demographics, and ironically, those with the strongest immune systems were the most susceptible to cytokine storms, which was likely a leading cause of death among the otherwise healthier infected. In short, strength, courage, and knowledge offered no protection from these dual threats, and in fact, arguably made them worse.</w:t>
+        <w:t xml:space="preserve">An unprecedented war, immediately followed by an unprecedented pandemic, taken together, are the cultural set pieces for Lovecraft’s particular brand of cosmic nihilism. At the time, it would have appeared that the more we learn about the world, the more dangerous and uncaring it’s revealed to be. Artillery shells don’t discriminate between the valorous and the cowardly, and the artillery operators themselves were miles away, shelling with explosives and poisons indiscriminately. The flu, a mysterious, invisible force, claimed victims across demographics, and ironically, those with the strongest immune systems were the most susceptible to cytokine storms, which was likely a leading cause of death among the otherwise healthier infected. In short, neither strength, nor courage, nor constitution, nor even knowledge offered sufficient protection from these dual threats, and in fact, all of these virtues arguably made things worse.</w:t>
       </w:r>
     </w:p>
     <w:p>
@@ -1539,7 +1539,15 @@
         <w:pStyle w:val="BodyText"/>
       </w:pPr>
       <w:r>
-        <w:t xml:space="preserve">Unconsciously, we can see the effects of the flu on Lovecraft’s writing throughout: his distrust of medicine as an institution, his repeated use of invisible and ineffable threats, his reliance on generalized, indescribable dread. The culture at large, and Lovecraft in particular, suppressed their flu experiences almost entirely, even though the US suffered ten times more casualties from the 1918 pandemic than from the war itself. Ultimately, this is what made Lovecraft stand apart from his contemporaries: while everyone was affected by both war and pestilence, Lovecraft articulated the horrors of war directly, and addressed the terror of pandemic only indirectly, through layers of unseen obfuscation… much like the flu itself.</w:t>
+        <w:t xml:space="preserve">Unconsciously, we can see the effects of the flu on Lovecraft’s writing throughout: his distrust of medicine as an institution, his repeated use of invisible and ineffable threats, and his reliance on generalized, indescribable dread. The culture at large, and Lovecraft in particular, suppressed their flu experiences almost entirely, even though the US suffered ten times more casualties from the 1918 pandemic than from the war itself.</w:t>
+      </w:r>
+    </w:p>
+    <w:p>
+      <w:pPr>
+        <w:pStyle w:val="BodyText"/>
+      </w:pPr>
+      <w:r>
+        <w:t xml:space="preserve">Ultimately, this is what made Lovecraft stand apart from his contemporaries: while everyone was affected by both war and pestilence, Lovecraft articulated the horrors of war directly, and addressed the terror of pandemic only indirectly, through layers of unseen obfuscation… much like the flu itself.</w:t>
       </w:r>
     </w:p>
     <w:bookmarkEnd w:id="28"/>

</xml_diff>